<commit_message>
Almost done with jigsaw game
</commit_message>
<xml_diff>
--- a/StudentFolders/A3/HarinS/Game Design Proposal.docx
+++ b/StudentFolders/A3/HarinS/Game Design Proposal.docx
@@ -1074,6 +1074,40 @@
         <w:t>Finished labeling the puzzles with numbers, solved showing up issue. Gotta fix the null problem</w:t>
       </w:r>
     </w:p>
+    <w:p/>
+    <w:p>
+      <w:r>
+        <w:t>12/2</w:t>
+      </w:r>
+    </w:p>
+    <w:p>
+      <w:r>
+        <w:lastRenderedPageBreak/>
+        <w:t>Goal: Fix the minor errors and make the jigsaw game null work</w:t>
+      </w:r>
+    </w:p>
+    <w:p>
+      <w:r>
+        <w:t>Done</w:t>
+      </w:r>
+    </w:p>
+    <w:p/>
+    <w:p>
+      <w:r>
+        <w:t>12/4</w:t>
+      </w:r>
+    </w:p>
+    <w:p>
+      <w:r>
+        <w:t>Goal: Finish jigsaw puzzle</w:t>
+      </w:r>
+    </w:p>
+    <w:p>
+      <w:r>
+        <w:t>Finished making the jigsaw puzzle so the pieces teleports to the center when finds the right drop zone. Gotta polish it.</w:t>
+      </w:r>
+    </w:p>
+    <w:p/>
     <w:sectPr>
       <w:pgSz w:w="12240" w:h="15840"/>
       <w:pgMar w:top="1440" w:right="1440" w:bottom="1440" w:left="1440" w:header="720" w:footer="720" w:gutter="0"/>

</xml_diff>

<commit_message>
Finished making Jigsaw Game / Started working on password logic
</commit_message>
<xml_diff>
--- a/StudentFolders/A3/HarinS/Game Design Proposal.docx
+++ b/StudentFolders/A3/HarinS/Game Design Proposal.docx
@@ -1108,6 +1108,21 @@
       </w:r>
     </w:p>
     <w:p/>
+    <w:p>
+      <w:r>
+        <w:t>12/8</w:t>
+      </w:r>
+    </w:p>
+    <w:p>
+      <w:r>
+        <w:t>Goal: Finish jigsaw puzzle and start working on final password</w:t>
+      </w:r>
+    </w:p>
+    <w:p>
+      <w:r>
+        <w:t>100% done with the jigsaw game. Finished green password in inventory logic.</w:t>
+      </w:r>
+    </w:p>
     <w:sectPr>
       <w:pgSz w:w="12240" w:h="15840"/>
       <w:pgMar w:top="1440" w:right="1440" w:bottom="1440" w:left="1440" w:header="720" w:footer="720" w:gutter="0"/>

</xml_diff>